<commit_message>
Rozbudowa raportu i prezentacji zaliczeniowej.
Pełny generator docs (build_docs.py), zaktualizowany raport Word i prezentacja PPT z wynikami analizy.

Co-authored-by: Cursor <cursoragent@cursor.com>
</commit_message>
<xml_diff>
--- a/docs/raport.docx
+++ b/docs/raport.docx
@@ -16,13 +16,7 @@
         <w:jc w:val="center"/>
       </w:pPr>
       <w:r>
-        <w:rPr>
-          <w:sz w:val="24"/>
-        </w:rPr>
-        <w:t>Analiza i wizualizacja danych – Pandas, DataFrame</w:t>
-        <w:br/>
-        <w:t>Merito Chorzów  •  2025/2026  •  semestr 3 (letni)</w:t>
-        <w:br/>
+        <w:t>Analiza szeregów czasowych na publicznym zbiorze danych (2015–2018)</w:t>
       </w:r>
     </w:p>
     <w:p>
@@ -30,7 +24,25 @@
         <w:jc w:val="center"/>
       </w:pPr>
       <w:r>
-        <w:t>Dawid Hetmańczyk — album 126674</w:t>
+        <w:rPr>
+          <w:sz w:val="24"/>
+        </w:rPr>
+        <w:t>Analiza i wizualizacja danych – Pandas, DataFrame</w:t>
+        <w:br/>
+        <w:t>Merito Chorzów</w:t>
+        <w:br/>
+        <w:t>Rok akademicki: 2025/2026  •  Semestr: 3 (letni)</w:t>
+        <w:br/>
+        <w:br/>
+      </w:r>
+    </w:p>
+    <w:p>
+      <w:pPr>
+        <w:pStyle w:val="Heading3"/>
+        <w:jc w:val="center"/>
+      </w:pPr>
+      <w:r>
+        <w:t>Skład sekcji projektowej:</w:t>
       </w:r>
     </w:p>
     <w:p>
@@ -38,7 +50,24 @@
         <w:jc w:val="center"/>
       </w:pPr>
       <w:r>
-        <w:t>Bartosz Bugla — album 180737</w:t>
+        <w:t>1. Dawid Hetmańczyk — numer albumu: 126674</w:t>
+      </w:r>
+    </w:p>
+    <w:p>
+      <w:pPr>
+        <w:jc w:val="center"/>
+      </w:pPr>
+      <w:r>
+        <w:t>2. Bartosz Bugla — numer albumu: 180737</w:t>
+      </w:r>
+    </w:p>
+    <w:p>
+      <w:pPr>
+        <w:jc w:val="center"/>
+      </w:pPr>
+      <w:r>
+        <w:br/>
+        <w:t>Repozytorium: https://github.com/BartoszBugla/prognoza-zapotrzebowania-na-energie</w:t>
       </w:r>
     </w:p>
     <w:p>
@@ -51,12 +80,92 @@
         <w:pStyle w:val="Heading1"/>
       </w:pPr>
       <w:r>
-        <w:t>1. Opis problemu</w:t>
+        <w:t>Spis treści</w:t>
+      </w:r>
+    </w:p>
+    <w:p>
+      <w:pPr>
+        <w:pStyle w:val="ListBullet"/>
+      </w:pPr>
+      <w:r>
+        <w:t>1. Wprowadzenie i opis problemu</w:t>
+      </w:r>
+    </w:p>
+    <w:p>
+      <w:pPr>
+        <w:pStyle w:val="ListBullet"/>
+      </w:pPr>
+      <w:r>
+        <w:t>2. Szczegółowy opis zbioru danych</w:t>
+      </w:r>
+    </w:p>
+    <w:p>
+      <w:pPr>
+        <w:pStyle w:val="ListBullet"/>
+      </w:pPr>
+      <w:r>
+        <w:t>3. Metodologia i narzędzia</w:t>
+      </w:r>
+    </w:p>
+    <w:p>
+      <w:pPr>
+        <w:pStyle w:val="ListBullet"/>
+      </w:pPr>
+      <w:r>
+        <w:t>4. Wstępna obróbka danych (pre-processing)</w:t>
+      </w:r>
+    </w:p>
+    <w:p>
+      <w:pPr>
+        <w:pStyle w:val="ListBullet"/>
+      </w:pPr>
+      <w:r>
+        <w:t>5. Analiza wizualna i dashboard</w:t>
+      </w:r>
+    </w:p>
+    <w:p>
+      <w:pPr>
+        <w:pStyle w:val="ListBullet"/>
+      </w:pPr>
+      <w:r>
+        <w:t>6. Analiza statystyczna</w:t>
+      </w:r>
+    </w:p>
+    <w:p>
+      <w:pPr>
+        <w:pStyle w:val="ListBullet"/>
+      </w:pPr>
+      <w:r>
+        <w:t>7. Analiza zaawansowana (szeregi czasowe i prognoza)</w:t>
+      </w:r>
+    </w:p>
+    <w:p>
+      <w:pPr>
+        <w:pStyle w:val="ListBullet"/>
+      </w:pPr>
+      <w:r>
+        <w:t>8. Mapowanie wymagań zaliczeniowych</w:t>
+      </w:r>
+    </w:p>
+    <w:p>
+      <w:pPr>
+        <w:pStyle w:val="ListBullet"/>
+      </w:pPr>
+      <w:r>
+        <w:t>9. Podsumowanie i wnioski</w:t>
+      </w:r>
+    </w:p>
+    <w:p>
+      <w:pPr>
+        <w:pStyle w:val="ListBullet"/>
+      </w:pPr>
+      <w:r>
+        <w:t>10. Załączniki</w:t>
       </w:r>
     </w:p>
     <w:p>
       <w:r>
-        <w:t>Celem jest analiza i prognozowanie zapotrzebowania na energię elektryczną w Hiszpanii na podstawie publicznych danych godzinowych (2015–2018). Badamy wzorce sezonowe i dobowe, wpływ pogody oraz budujemy prosty model predykcyjny w Pythonie z biblioteką Pandas.</w:t>
+        <w:br w:type="page"/>
       </w:r>
     </w:p>
     <w:p>
@@ -64,12 +173,105 @@
         <w:pStyle w:val="Heading1"/>
       </w:pPr>
       <w:r>
-        <w:t>2. Opis zbioru danych</w:t>
+        <w:t>1. Wprowadzenie i opis problemu</w:t>
       </w:r>
     </w:p>
     <w:p>
       <w:r>
-        <w:t>Zbiór Kaggle „Energy Consumption, Generation, Prices and Weather”: 35,064 wierszy godzinowych, okres 2014-12-31 – 2018-12-31. Zmienne: produkcja ze źródeł, zużycie, ceny, pogoda (5 miast).</w:t>
+        <w:t>Niniejszy raport dokumentuje projekt zaliczeniowy z przedmiotu „Analiza i wizualizacja danych – Pandas, DataFrame”. Celem jest zaawansowana analiza statystyczna publicznych danych elektroenergetycznych z wykorzystaniem języka Python i biblioteki Pandas.</w:t>
+      </w:r>
+    </w:p>
+    <w:p>
+      <w:r>
+        <w:t>Hiszpański system elektroenergetyczny w analizowanym okresie (2015–2018) charakteryzował się rosnącym udziałem odnawialnych źródeł energii (OZE) oraz zróżnicowanym profilem zużycia w skali dobowej i sezonowej. Operatorzy systemu muszą prognozować obciążenie (load) z wyprzedzeniem, aby zbilansować produkcję i uniknąć przeciążeń sieci.</w:t>
+      </w:r>
+    </w:p>
+    <w:p>
+      <w:pPr>
+        <w:pStyle w:val="Heading2"/>
+      </w:pPr>
+      <w:r>
+        <w:t>1.1 Cele projektu</w:t>
+      </w:r>
+    </w:p>
+    <w:p>
+      <w:pPr>
+        <w:pStyle w:val="ListBullet"/>
+      </w:pPr>
+      <w:r>
+        <w:t>Załadowanie i przygotowanie danych do postaci analitycznej (DataFrame).</w:t>
+      </w:r>
+    </w:p>
+    <w:p>
+      <w:pPr>
+        <w:pStyle w:val="ListBullet"/>
+      </w:pPr>
+      <w:r>
+        <w:t>Identyfikacja wzorców sezonowych, dobowych i tygodniowych zużycia energii.</w:t>
+      </w:r>
+    </w:p>
+    <w:p>
+      <w:pPr>
+        <w:pStyle w:val="ListBullet"/>
+      </w:pPr>
+      <w:r>
+        <w:t>Ocena wpływu pogody (temperatura) i struktury produkcji (OZE vs paliwa kopalne).</w:t>
+      </w:r>
+    </w:p>
+    <w:p>
+      <w:pPr>
+        <w:pStyle w:val="ListBullet"/>
+      </w:pPr>
+      <w:r>
+        <w:t>Przeprowadzenie testów statystycznych i analizy rozkładów.</w:t>
+      </w:r>
+    </w:p>
+    <w:p>
+      <w:pPr>
+        <w:pStyle w:val="ListBullet"/>
+      </w:pPr>
+      <w:r>
+        <w:t>Dekompozycja szeregu czasowego oraz budowa modelu predykcyjnego baseline.</w:t>
+      </w:r>
+    </w:p>
+    <w:p>
+      <w:pPr>
+        <w:pStyle w:val="Heading2"/>
+      </w:pPr>
+      <w:r>
+        <w:t>1.2 Hipotezy badawcze</w:t>
+      </w:r>
+    </w:p>
+    <w:p>
+      <w:pPr>
+        <w:pStyle w:val="ListBullet"/>
+      </w:pPr>
+      <w:r>
+        <w:t>H1: Zużycie energii w weekendy jest istotnie niższe niż w dni robocze.</w:t>
+      </w:r>
+    </w:p>
+    <w:p>
+      <w:pPr>
+        <w:pStyle w:val="ListBullet"/>
+      </w:pPr>
+      <w:r>
+        <w:t>H2: Zużycie wykazuje silną sezonowość roczną (zima/lato vs wiosna/jesień).</w:t>
+      </w:r>
+    </w:p>
+    <w:p>
+      <w:pPr>
+        <w:pStyle w:val="ListBullet"/>
+      </w:pPr>
+      <w:r>
+        <w:t>H3: Temperatura otoczenia koreluje z poziomem zużycia (ogrzewanie/klimatyzacja).</w:t>
+      </w:r>
+    </w:p>
+    <w:p>
+      <w:pPr>
+        <w:pStyle w:val="ListBullet"/>
+      </w:pPr>
+      <w:r>
+        <w:t>H4: Prosty model regresji na cechach czasowych i pogodowych osiąga akceptowalny błąd MAPE.</w:t>
       </w:r>
     </w:p>
     <w:p>
@@ -77,7 +279,12 @@
         <w:pStyle w:val="Heading1"/>
       </w:pPr>
       <w:r>
-        <w:t>3. Analiza danych</w:t>
+        <w:t>2. Szczegółowy opis zbioru danych</w:t>
+      </w:r>
+    </w:p>
+    <w:p>
+      <w:r>
+        <w:t>Źródło: publiczny zbiór Kaggle „Energy Consumption, Generation, Prices and Weather” (autor: Nicholas J. Hana), pochodzący z danych ENTSO-E i hiszpańskiego operatora Red Eléctrica. Analiza obejmuje 35,064 obserwacji godzinowych w okresie od 2014-12-31 do 2018-12-31.</w:t>
       </w:r>
     </w:p>
     <w:p>
@@ -85,12 +292,196 @@
         <w:pStyle w:val="Heading2"/>
       </w:pPr>
       <w:r>
-        <w:t>3.1 Pre-processing</w:t>
+        <w:t>2.1 Struktura danych</w:t>
       </w:r>
     </w:p>
+    <w:tbl>
+      <w:tblPr>
+        <w:tblStyle w:val="TableGrid"/>
+        <w:tblW w:type="auto" w:w="0"/>
+        <w:tblLook w:firstColumn="1" w:firstRow="1" w:lastColumn="0" w:lastRow="0" w:noHBand="0" w:noVBand="1" w:val="04A0"/>
+      </w:tblPr>
+      <w:tblGrid>
+        <w:gridCol w:w="2880"/>
+        <w:gridCol w:w="2880"/>
+        <w:gridCol w:w="2880"/>
+      </w:tblGrid>
+      <w:tr>
+        <w:tc>
+          <w:tcPr>
+            <w:tcW w:type="dxa" w:w="2880"/>
+          </w:tcPr>
+          <w:p>
+            <w:r>
+              <w:rPr>
+                <w:b/>
+                <w:color w:val="1565C0"/>
+              </w:rPr>
+              <w:t>Kategoria</w:t>
+            </w:r>
+          </w:p>
+        </w:tc>
+        <w:tc>
+          <w:tcPr>
+            <w:tcW w:type="dxa" w:w="2880"/>
+          </w:tcPr>
+          <w:p>
+            <w:r>
+              <w:rPr>
+                <w:b/>
+                <w:color w:val="1565C0"/>
+              </w:rPr>
+              <w:t>Przykładowe kolumny</w:t>
+            </w:r>
+          </w:p>
+        </w:tc>
+        <w:tc>
+          <w:tcPr>
+            <w:tcW w:type="dxa" w:w="2880"/>
+          </w:tcPr>
+          <w:p>
+            <w:r>
+              <w:rPr>
+                <w:b/>
+                <w:color w:val="1565C0"/>
+              </w:rPr>
+              <w:t>Jednostka / opis</w:t>
+            </w:r>
+          </w:p>
+        </w:tc>
+      </w:tr>
+      <w:tr>
+        <w:tc>
+          <w:tcPr>
+            <w:tcW w:type="dxa" w:w="2880"/>
+          </w:tcPr>
+          <w:p>
+            <w:r>
+              <w:t>Zużycie (load)</w:t>
+            </w:r>
+          </w:p>
+        </w:tc>
+        <w:tc>
+          <w:tcPr>
+            <w:tcW w:type="dxa" w:w="2880"/>
+          </w:tcPr>
+          <w:p>
+            <w:r>
+              <w:t>total load actual, total load forecast</w:t>
+            </w:r>
+          </w:p>
+        </w:tc>
+        <w:tc>
+          <w:tcPr>
+            <w:tcW w:type="dxa" w:w="2880"/>
+          </w:tcPr>
+          <w:p>
+            <w:r>
+              <w:t>MW — obciążenie sieci</w:t>
+            </w:r>
+          </w:p>
+        </w:tc>
+      </w:tr>
+      <w:tr>
+        <w:tc>
+          <w:tcPr>
+            <w:tcW w:type="dxa" w:w="2880"/>
+          </w:tcPr>
+          <w:p>
+            <w:r>
+              <w:t>Produkcja</w:t>
+            </w:r>
+          </w:p>
+        </w:tc>
+        <w:tc>
+          <w:tcPr>
+            <w:tcW w:type="dxa" w:w="2880"/>
+          </w:tcPr>
+          <w:p>
+            <w:r>
+              <w:t>20 kolumn generation *</w:t>
+            </w:r>
+          </w:p>
+        </w:tc>
+        <w:tc>
+          <w:tcPr>
+            <w:tcW w:type="dxa" w:w="2880"/>
+          </w:tcPr>
+          <w:p>
+            <w:r>
+              <w:t>MW — wiatr, słońce, gaz, węgiel...</w:t>
+            </w:r>
+          </w:p>
+        </w:tc>
+      </w:tr>
+      <w:tr>
+        <w:tc>
+          <w:tcPr>
+            <w:tcW w:type="dxa" w:w="2880"/>
+          </w:tcPr>
+          <w:p>
+            <w:r>
+              <w:t>Ceny</w:t>
+            </w:r>
+          </w:p>
+        </w:tc>
+        <w:tc>
+          <w:tcPr>
+            <w:tcW w:type="dxa" w:w="2880"/>
+          </w:tcPr>
+          <w:p>
+            <w:r>
+              <w:t>price day ahead, price actual</w:t>
+            </w:r>
+          </w:p>
+        </w:tc>
+        <w:tc>
+          <w:tcPr>
+            <w:tcW w:type="dxa" w:w="2880"/>
+          </w:tcPr>
+          <w:p>
+            <w:r>
+              <w:t>EUR/MWh</w:t>
+            </w:r>
+          </w:p>
+        </w:tc>
+      </w:tr>
+      <w:tr>
+        <w:tc>
+          <w:tcPr>
+            <w:tcW w:type="dxa" w:w="2880"/>
+          </w:tcPr>
+          <w:p>
+            <w:r>
+              <w:t>Pogoda</w:t>
+            </w:r>
+          </w:p>
+        </w:tc>
+        <w:tc>
+          <w:tcPr>
+            <w:tcW w:type="dxa" w:w="2880"/>
+          </w:tcPr>
+          <w:p>
+            <w:r>
+              <w:t>temp, humidity, wind_speed (5 miast)</w:t>
+            </w:r>
+          </w:p>
+        </w:tc>
+        <w:tc>
+          <w:tcPr>
+            <w:tcW w:type="dxa" w:w="2880"/>
+          </w:tcPr>
+          <w:p>
+            <w:r>
+              <w:t>Po agregacji: °C, %, m/s</w:t>
+            </w:r>
+          </w:p>
+        </w:tc>
+      </w:tr>
+    </w:tbl>
     <w:p>
       <w:r>
-        <w:t>Wczytanie CSV z parsowaniem dat, usunięcie pustych kolumn, uzupełnienie braków, scalenie danych pogodowych (średnia z 5 miast, °C), cechy pochodne: godzina, weekend, udział OZE.</w:t>
+        <w:t>Po scaleniu danych pogodowych (średnia z pięciu hiszpańskich miast) i inżynierii cech końcowy DataFrame zawiera 41 kolumn. Indeks: timestamp UTC (DatetimeIndex).</w:t>
       </w:r>
     </w:p>
     <w:p>
@@ -98,12 +489,230 @@
         <w:pStyle w:val="Heading2"/>
       </w:pPr>
       <w:r>
-        <w:t>3.2 Wizualizacja</w:t>
+        <w:t>2.2 Jakość i ograniczenia danych</w:t>
+      </w:r>
+    </w:p>
+    <w:p>
+      <w:pPr>
+        <w:pStyle w:val="ListBullet"/>
+      </w:pPr>
+      <w:r>
+        <w:t>Braki w kolumnach pogodowych — uzupełnione metodą forward/backward fill po join.</w:t>
+      </w:r>
+    </w:p>
+    <w:p>
+      <w:pPr>
+        <w:pStyle w:val="ListBullet"/>
+      </w:pPr>
+      <w:r>
+        <w:t>Kilka kolumn produkcji całkowicie pustych — usunięte przed analizą.</w:t>
+      </w:r>
+    </w:p>
+    <w:p>
+      <w:pPr>
+        <w:pStyle w:val="ListBullet"/>
+      </w:pPr>
+      <w:r>
+        <w:t>Dane pogodowe w Kelwinach w źródle — przeliczone na °C (odejmowanie 273.15).</w:t>
+      </w:r>
+    </w:p>
+    <w:p>
+      <w:pPr>
+        <w:pStyle w:val="ListBullet"/>
+      </w:pPr>
+      <w:r>
+        <w:t>Granularność godzinowa — odpowiednia do profili dobowych i prognoz krótkoterminowych.</w:t>
+      </w:r>
+    </w:p>
+    <w:p>
+      <w:pPr>
+        <w:pStyle w:val="Heading1"/>
+      </w:pPr>
+      <w:r>
+        <w:t>3. Metodologia i narzędzia</w:t>
       </w:r>
     </w:p>
     <w:p>
       <w:r>
-        <w:t>Poniżej wybrane wykresy; pełna analiza w pliku analiza.ipynb (w tym dashboard Plotly).</w:t>
+        <w:t>Analiza została zaimplementowana w notatniku Jupyter analiza.ipynb. Stosowany stack technologiczny:</w:t>
+      </w:r>
+    </w:p>
+    <w:p>
+      <w:pPr>
+        <w:pStyle w:val="ListBullet"/>
+      </w:pPr>
+      <w:r>
+        <w:t>Python 3.12+, Pandas (DataFrame, resample, groupby, merge)</w:t>
+      </w:r>
+    </w:p>
+    <w:p>
+      <w:pPr>
+        <w:pStyle w:val="ListBullet"/>
+      </w:pPr>
+      <w:r>
+        <w:t>NumPy — obliczenia numeryczne</w:t>
+      </w:r>
+    </w:p>
+    <w:p>
+      <w:pPr>
+        <w:pStyle w:val="ListBullet"/>
+      </w:pPr>
+      <w:r>
+        <w:t>Matplotlib, Seaborn — wykresy statyczne</w:t>
+      </w:r>
+    </w:p>
+    <w:p>
+      <w:pPr>
+        <w:pStyle w:val="ListBullet"/>
+      </w:pPr>
+      <w:r>
+        <w:t>Plotly — interaktywny dashboard (4 panele)</w:t>
+      </w:r>
+    </w:p>
+    <w:p>
+      <w:pPr>
+        <w:pStyle w:val="ListBullet"/>
+      </w:pPr>
+      <w:r>
+        <w:t>SciPy — testy Shapiro-Wilk, Mann-Whitney U, korelacje Pearsona i Spearmana</w:t>
+      </w:r>
+    </w:p>
+    <w:p>
+      <w:pPr>
+        <w:pStyle w:val="ListBullet"/>
+      </w:pPr>
+      <w:r>
+        <w:t>statsmodels — dekompozycja sezonowa szeregu czasowego</w:t>
+      </w:r>
+    </w:p>
+    <w:p>
+      <w:pPr>
+        <w:pStyle w:val="ListBullet"/>
+      </w:pPr>
+      <w:r>
+        <w:t>scikit-learn — regresja liniowa, metryki MAE/MAPE/R²</w:t>
+      </w:r>
+    </w:p>
+    <w:p>
+      <w:pPr>
+        <w:pStyle w:val="Heading1"/>
+      </w:pPr>
+      <w:r>
+        <w:t>4. Wstępna obróbka danych (pre-processing)</w:t>
+      </w:r>
+    </w:p>
+    <w:p>
+      <w:r>
+        <w:t>Kolejność operacji zgodna z dobrymi praktykami pracy z danymi szeregów czasowych:</w:t>
+      </w:r>
+    </w:p>
+    <w:p>
+      <w:pPr>
+        <w:pStyle w:val="Heading3"/>
+      </w:pPr>
+      <w:r>
+        <w:t>4.1 Wczytanie</w:t>
+      </w:r>
+    </w:p>
+    <w:p>
+      <w:pPr>
+        <w:pStyle w:val="ListBullet"/>
+      </w:pPr>
+      <w:r>
+        <w:t>pd.read_csv(..., parse_dates=["time"], index_col="time") — automatyczny indeks czasowy.</w:t>
+      </w:r>
+    </w:p>
+    <w:p>
+      <w:pPr>
+        <w:pStyle w:val="ListBullet"/>
+      </w:pPr>
+      <w:r>
+        <w:t>Wymuszenie strefy UTC na indeksie dla spójności join z pogodą.</w:t>
+      </w:r>
+    </w:p>
+    <w:p>
+      <w:pPr>
+        <w:pStyle w:val="Heading3"/>
+      </w:pPr>
+      <w:r>
+        <w:t>4.2 Czyszczenie</w:t>
+      </w:r>
+    </w:p>
+    <w:p>
+      <w:pPr>
+        <w:pStyle w:val="ListBullet"/>
+      </w:pPr>
+      <w:r>
+        <w:t>Usunięcie kolumn, w których 100% wartości to NaN.</w:t>
+      </w:r>
+    </w:p>
+    <w:p>
+      <w:pPr>
+        <w:pStyle w:val="ListBullet"/>
+      </w:pPr>
+      <w:r>
+        <w:t>Uzupełnienie braków: ffill() następnie bfill() — zachowanie ciągłości szeregu.</w:t>
+      </w:r>
+    </w:p>
+    <w:p>
+      <w:pPr>
+        <w:pStyle w:val="Heading3"/>
+      </w:pPr>
+      <w:r>
+        <w:t>4.3 Transformacje i cechy pochodne</w:t>
+      </w:r>
+    </w:p>
+    <w:p>
+      <w:pPr>
+        <w:pStyle w:val="ListBullet"/>
+      </w:pPr>
+      <w:r>
+        <w:t>Agregacja pogody: groupby(timestamp).mean() dla zmiennych numerycznych.</w:t>
+      </w:r>
+    </w:p>
+    <w:p>
+      <w:pPr>
+        <w:pStyle w:val="ListBullet"/>
+      </w:pPr>
+      <w:r>
+        <w:t>generacja_oze, generacja_paliwa, generacja_calkowita, udzial_oze [%].</w:t>
+      </w:r>
+    </w:p>
+    <w:p>
+      <w:pPr>
+        <w:pStyle w:val="ListBullet"/>
+      </w:pPr>
+      <w:r>
+        <w:t>Cechy kalendarzowe: godzina, dzien_tyg, miesiac, rok, weekend (0/1).</w:t>
+      </w:r>
+    </w:p>
+    <w:p>
+      <w:pPr>
+        <w:pStyle w:val="Heading3"/>
+      </w:pPr>
+      <w:r>
+        <w:t>4.4 Łączenie</w:t>
+      </w:r>
+    </w:p>
+    <w:p>
+      <w:pPr>
+        <w:pStyle w:val="ListBullet"/>
+      </w:pPr>
+      <w:r>
+        <w:t>df = energy_df.join(weather_avg, how='left') — następnie uzupełnienie braków pogodowych.</w:t>
+      </w:r>
+    </w:p>
+    <w:p>
+      <w:pPr>
+        <w:pStyle w:val="Heading1"/>
+      </w:pPr>
+      <w:r>
+        <w:t>5. Analiza wizualna i dashboard</w:t>
+      </w:r>
+    </w:p>
+    <w:p>
+      <w:r>
+        <w:t>Analiza wizualna pozwala zidentyfikować szczyty obciążenia, sezonowość i różnice profilu dobowego. Poniżej wybrane wykresy wygenerowane automatycznie z danych (spójne z notebookiem).</w:t>
       </w:r>
     </w:p>
     <w:p>
@@ -113,7 +722,7 @@
       <w:r>
         <w:drawing>
           <wp:inline xmlns:a="http://schemas.openxmlformats.org/drawingml/2006/main" xmlns:pic="http://schemas.openxmlformats.org/drawingml/2006/picture">
-            <wp:extent cx="5486400" cy="1851239"/>
+            <wp:extent cx="5669280" cy="1912947"/>
             <wp:docPr id="1" name="Picture 1"/>
             <wp:cNvGraphicFramePr>
               <a:graphicFrameLocks noChangeAspect="1"/>
@@ -134,7 +743,7 @@
                   <pic:spPr>
                     <a:xfrm>
                       <a:off x="0" y="0"/>
-                      <a:ext cx="5486400" cy="1851239"/>
+                      <a:ext cx="5669280" cy="1912947"/>
                     </a:xfrm>
                     <a:prstGeom prst="rect"/>
                   </pic:spPr>
@@ -150,9 +759,23 @@
         <w:jc w:val="center"/>
       </w:pPr>
       <w:r>
+        <w:rPr>
+          <w:i/>
+          <w:color w:val="607D8B"/>
+          <w:sz w:val="18"/>
+        </w:rPr>
+        <w:t>Rys. 1. Średnie dzienne zużycie energii w latach 2015–2018.</w:t>
+      </w:r>
+    </w:p>
+    <w:p/>
+    <w:p>
+      <w:pPr>
+        <w:jc w:val="center"/>
+      </w:pPr>
+      <w:r>
         <w:drawing>
           <wp:inline xmlns:a="http://schemas.openxmlformats.org/drawingml/2006/main" xmlns:pic="http://schemas.openxmlformats.org/drawingml/2006/picture">
-            <wp:extent cx="5486400" cy="2701948"/>
+            <wp:extent cx="5669280" cy="2792013"/>
             <wp:docPr id="2" name="Picture 2"/>
             <wp:cNvGraphicFramePr>
               <a:graphicFrameLocks noChangeAspect="1"/>
@@ -173,7 +796,7 @@
                   <pic:spPr>
                     <a:xfrm>
                       <a:off x="0" y="0"/>
-                      <a:ext cx="5486400" cy="2701948"/>
+                      <a:ext cx="5669280" cy="2792013"/>
                     </a:xfrm>
                     <a:prstGeom prst="rect"/>
                   </pic:spPr>
@@ -189,9 +812,23 @@
         <w:jc w:val="center"/>
       </w:pPr>
       <w:r>
+        <w:rPr>
+          <w:i/>
+          <w:color w:val="607D8B"/>
+          <w:sz w:val="18"/>
+        </w:rPr>
+        <w:t>Rys. 2. Profil dobowy — dzień roboczy vs weekend.</w:t>
+      </w:r>
+    </w:p>
+    <w:p/>
+    <w:p>
+      <w:pPr>
+        <w:jc w:val="center"/>
+      </w:pPr>
+      <w:r>
         <w:drawing>
           <wp:inline xmlns:a="http://schemas.openxmlformats.org/drawingml/2006/main" xmlns:pic="http://schemas.openxmlformats.org/drawingml/2006/picture">
-            <wp:extent cx="5486400" cy="3102302"/>
+            <wp:extent cx="5669280" cy="3205712"/>
             <wp:docPr id="3" name="Picture 3"/>
             <wp:cNvGraphicFramePr>
               <a:graphicFrameLocks noChangeAspect="1"/>
@@ -212,7 +849,7 @@
                   <pic:spPr>
                     <a:xfrm>
                       <a:off x="0" y="0"/>
-                      <a:ext cx="5486400" cy="3102302"/>
+                      <a:ext cx="5669280" cy="3205712"/>
                     </a:xfrm>
                     <a:prstGeom prst="rect"/>
                   </pic:spPr>
@@ -228,9 +865,23 @@
         <w:jc w:val="center"/>
       </w:pPr>
       <w:r>
+        <w:rPr>
+          <w:i/>
+          <w:color w:val="607D8B"/>
+          <w:sz w:val="18"/>
+        </w:rPr>
+        <w:t>Rys. 3. Heatmapa: interakcja godziny dnia i miesiąca.</w:t>
+      </w:r>
+    </w:p>
+    <w:p/>
+    <w:p>
+      <w:pPr>
+        <w:jc w:val="center"/>
+      </w:pPr>
+      <w:r>
         <w:drawing>
           <wp:inline xmlns:a="http://schemas.openxmlformats.org/drawingml/2006/main" xmlns:pic="http://schemas.openxmlformats.org/drawingml/2006/picture">
-            <wp:extent cx="5486400" cy="2701948"/>
+            <wp:extent cx="5669280" cy="2792013"/>
             <wp:docPr id="4" name="Picture 4"/>
             <wp:cNvGraphicFramePr>
               <a:graphicFrameLocks noChangeAspect="1"/>
@@ -251,7 +902,7 @@
                   <pic:spPr>
                     <a:xfrm>
                       <a:off x="0" y="0"/>
-                      <a:ext cx="5486400" cy="2701948"/>
+                      <a:ext cx="5669280" cy="2792013"/>
                     </a:xfrm>
                     <a:prstGeom prst="rect"/>
                   </pic:spPr>
@@ -264,30 +915,18 @@
     </w:p>
     <w:p>
       <w:pPr>
-        <w:pStyle w:val="Heading2"/>
+        <w:jc w:val="center"/>
       </w:pPr>
       <w:r>
-        <w:t>3.3 Statystyka</w:t>
+        <w:rPr>
+          <w:i/>
+          <w:color w:val="607D8B"/>
+          <w:sz w:val="18"/>
+        </w:rPr>
+        <w:t>Rys. 4. Udział produkcji OZE vs paliwa kopalne (średnia miesięczna).</w:t>
       </w:r>
     </w:p>
-    <w:p>
-      <w:r>
-        <w:t>Średnie zużycie: 28,698 MW. Test Shapiro-Wilka: p = 9.16e-06. Mann-Whitney (weekend vs dzień roboczy): p = 0.00e+00 — różnica istotna. Korelacja zużycie–temperatura: r = 0.20.</w:t>
-      </w:r>
-    </w:p>
-    <w:p>
-      <w:pPr>
-        <w:pStyle w:val="Heading2"/>
-      </w:pPr>
-      <w:r>
-        <w:t>3.4 Analiza zaawansowana</w:t>
-      </w:r>
-    </w:p>
-    <w:p>
-      <w:r>
-        <w:t>Dekompozycja szeregu czasowego, ACF/PACF, prognoza regresją liniową (MAE = 3,384 MW, MAPE = 11.7%).</w:t>
-      </w:r>
-    </w:p>
+    <w:p/>
     <w:p>
       <w:pPr>
         <w:jc w:val="center"/>
@@ -295,7 +934,7 @@
       <w:r>
         <w:drawing>
           <wp:inline xmlns:a="http://schemas.openxmlformats.org/drawingml/2006/main" xmlns:pic="http://schemas.openxmlformats.org/drawingml/2006/picture">
-            <wp:extent cx="5486400" cy="1859224"/>
+            <wp:extent cx="5669280" cy="3605221"/>
             <wp:docPr id="5" name="Picture 5"/>
             <wp:cNvGraphicFramePr>
               <a:graphicFrameLocks noChangeAspect="1"/>
@@ -304,7 +943,7 @@
               <a:graphicData uri="http://schemas.openxmlformats.org/drawingml/2006/picture">
                 <pic:pic>
                   <pic:nvPicPr>
-                    <pic:cNvPr id="0" name="05_prognoza.png"/>
+                    <pic:cNvPr id="0" name="07_weekend_box.png"/>
                     <pic:cNvPicPr/>
                   </pic:nvPicPr>
                   <pic:blipFill>
@@ -316,7 +955,7 @@
                   <pic:spPr>
                     <a:xfrm>
                       <a:off x="0" y="0"/>
-                      <a:ext cx="5486400" cy="1859224"/>
+                      <a:ext cx="5669280" cy="3605221"/>
                     </a:xfrm>
                     <a:prstGeom prst="rect"/>
                   </pic:spPr>
@@ -329,10 +968,628 @@
     </w:p>
     <w:p>
       <w:pPr>
+        <w:jc w:val="center"/>
+      </w:pPr>
+      <w:r>
+        <w:rPr>
+          <w:i/>
+          <w:color w:val="607D8B"/>
+          <w:sz w:val="18"/>
+        </w:rPr>
+        <w:t>Rys. 5. Rozkład zużycia — porównanie dni roboczych i weekendów.</w:t>
+      </w:r>
+    </w:p>
+    <w:p/>
+    <w:p>
+      <w:pPr>
+        <w:pStyle w:val="Heading2"/>
+      </w:pPr>
+      <w:r>
+        <w:t>5.1 Dashboard interaktywny (Plotly)</w:t>
+      </w:r>
+    </w:p>
+    <w:p>
+      <w:r>
+        <w:t>W sekcji 3.8 pliku analiza.ipynb zbudowano dashboard Plotly z czterema panelami: (1) szereg zużycia, (2) profil dobowy, (3) zależność cena–zużycie, (4) udział OZE w czasie. Dashboard umożliwia interaktywny zoom i odczyt wartości po najechaniu kursorem — uzupełnia statyczne wykresy o eksplorację dynamiczną, zgodnie z wymaganiami zaliczeniowymi.</w:t>
+      </w:r>
+    </w:p>
+    <w:p>
+      <w:pPr>
         <w:pStyle w:val="Heading1"/>
       </w:pPr>
       <w:r>
-        <w:t>4. Wnioski</w:t>
+        <w:t>6. Analiza statystyczna</w:t>
+      </w:r>
+    </w:p>
+    <w:p>
+      <w:pPr>
+        <w:pStyle w:val="Heading2"/>
+      </w:pPr>
+      <w:r>
+        <w:t>6.1 Statystyki opisowe</w:t>
+      </w:r>
+    </w:p>
+    <w:p>
+      <w:r>
+        <w:t>Dla zmiennej total load actual (zużycie godzinowe) obliczono: średnia = 28,697.61 MW, mediana = 28,902.00 MW, odchylenie standardowe = 4,575.87 MW, minimum = 18,041.00 MW, maksimum = 41,015.00 MW.</w:t>
+      </w:r>
+    </w:p>
+    <w:p>
+      <w:pPr>
+        <w:jc w:val="center"/>
+      </w:pPr>
+      <w:r>
+        <w:drawing>
+          <wp:inline xmlns:a="http://schemas.openxmlformats.org/drawingml/2006/main" xmlns:pic="http://schemas.openxmlformats.org/drawingml/2006/picture">
+            <wp:extent cx="5669280" cy="2786595"/>
+            <wp:docPr id="6" name="Picture 6"/>
+            <wp:cNvGraphicFramePr>
+              <a:graphicFrameLocks noChangeAspect="1"/>
+            </wp:cNvGraphicFramePr>
+            <a:graphic>
+              <a:graphicData uri="http://schemas.openxmlformats.org/drawingml/2006/picture">
+                <pic:pic>
+                  <pic:nvPicPr>
+                    <pic:cNvPr id="0" name="06_rozkład.png"/>
+                    <pic:cNvPicPr/>
+                  </pic:nvPicPr>
+                  <pic:blipFill>
+                    <a:blip r:embed="rId14"/>
+                    <a:stretch>
+                      <a:fillRect/>
+                    </a:stretch>
+                  </pic:blipFill>
+                  <pic:spPr>
+                    <a:xfrm>
+                      <a:off x="0" y="0"/>
+                      <a:ext cx="5669280" cy="2786595"/>
+                    </a:xfrm>
+                    <a:prstGeom prst="rect"/>
+                  </pic:spPr>
+                </pic:pic>
+              </a:graphicData>
+            </a:graphic>
+          </wp:inline>
+        </w:drawing>
+      </w:r>
+    </w:p>
+    <w:p>
+      <w:pPr>
+        <w:jc w:val="center"/>
+      </w:pPr>
+      <w:r>
+        <w:rPr>
+          <w:i/>
+          <w:color w:val="607D8B"/>
+          <w:sz w:val="18"/>
+        </w:rPr>
+        <w:t>Rys. 6. Histogram dziennych średnich zużycia — rozkład lekko skośny.</w:t>
+      </w:r>
+    </w:p>
+    <w:p/>
+    <w:p>
+      <w:pPr>
+        <w:pStyle w:val="Heading2"/>
+      </w:pPr>
+      <w:r>
+        <w:t>6.2 Test normalności (Shapiro-Wilk)</w:t>
+      </w:r>
+    </w:p>
+    <w:p>
+      <w:r>
+        <w:t>Dla próby 500 dziennych średnich test Shapiro-Wilk dał statystykę W = 0.9823, p-value = 9.16e-06. Ponieważ p &lt; 0.05, odrzucamy hipotezę normalności — w dalszej analizie stosujemy testy nieparametryczne (Mann-Whitney) oraz miary robustne.</w:t>
+      </w:r>
+    </w:p>
+    <w:p>
+      <w:pPr>
+        <w:pStyle w:val="Heading2"/>
+      </w:pPr>
+      <w:r>
+        <w:t>6.3 Test Mann-Whitney U (weekend vs dzień roboczy)</w:t>
+      </w:r>
+    </w:p>
+    <w:p>
+      <w:r>
+        <w:t>Test Mann-Whitney U dla dwóch niezależnych prób (obciążenie w dni robocze vs weekendy): statystyka U = 166,211,048, p-value = 0.00e+00. Różnica jest statystycznie istotna na poziomie α = 0.05. Średnie: dni robocze 29,425 MW, weekendy 26,884 MW (niższe o ok. 8.6%). Hipoteza H1 potwierdzona.</w:t>
+      </w:r>
+    </w:p>
+    <w:p>
+      <w:pPr>
+        <w:pStyle w:val="Heading2"/>
+      </w:pPr>
+      <w:r>
+        <w:t>6.4 Korelacje</w:t>
+      </w:r>
+    </w:p>
+    <w:p>
+      <w:r>
+        <w:t>Pearson (zużycie vs temperatura): r = 0.203, p = 0.00e+00. Spearman (bardziej odporna na wartości odstające): ρ = 0.182. Pearson (zużycie vs cena day-ahead): r = 0.474. Wskazuje to na związek temperatury z obciążeniem (ogrzewanie/zużycie letnie).</w:t>
+      </w:r>
+    </w:p>
+    <w:p>
+      <w:pPr>
+        <w:pStyle w:val="Heading1"/>
+      </w:pPr>
+      <w:r>
+        <w:t>7. Analiza zaawansowana</w:t>
+      </w:r>
+    </w:p>
+    <w:p>
+      <w:pPr>
+        <w:pStyle w:val="Heading2"/>
+      </w:pPr>
+      <w:r>
+        <w:t>7.1 Analiza szeregów czasowych</w:t>
+      </w:r>
+    </w:p>
+    <w:p>
+      <w:r>
+        <w:t>Zastosowano dekompozycję addytywną (statsmodels.seasonal_decompose) z okresem 365 dni na dziennych średnich zużycia. Wyodrębniono składowe: trend, sezonowość roczną i reszty. W notebooku dodatkowo analizowano wykresy ACF/PACF dla oceny autokorelacji.</w:t>
+      </w:r>
+    </w:p>
+    <w:p>
+      <w:pPr>
+        <w:jc w:val="center"/>
+      </w:pPr>
+      <w:r>
+        <w:drawing>
+          <wp:inline xmlns:a="http://schemas.openxmlformats.org/drawingml/2006/main" xmlns:pic="http://schemas.openxmlformats.org/drawingml/2006/picture">
+            <wp:extent cx="5943600" cy="4437645"/>
+            <wp:docPr id="7" name="Picture 7"/>
+            <wp:cNvGraphicFramePr>
+              <a:graphicFrameLocks noChangeAspect="1"/>
+            </wp:cNvGraphicFramePr>
+            <a:graphic>
+              <a:graphicData uri="http://schemas.openxmlformats.org/drawingml/2006/picture">
+                <pic:pic>
+                  <pic:nvPicPr>
+                    <pic:cNvPr id="0" name="08_dekompozycja.png"/>
+                    <pic:cNvPicPr/>
+                  </pic:nvPicPr>
+                  <pic:blipFill>
+                    <a:blip r:embed="rId15"/>
+                    <a:stretch>
+                      <a:fillRect/>
+                    </a:stretch>
+                  </pic:blipFill>
+                  <pic:spPr>
+                    <a:xfrm>
+                      <a:off x="0" y="0"/>
+                      <a:ext cx="5943600" cy="4437645"/>
+                    </a:xfrm>
+                    <a:prstGeom prst="rect"/>
+                  </pic:spPr>
+                </pic:pic>
+              </a:graphicData>
+            </a:graphic>
+          </wp:inline>
+        </w:drawing>
+      </w:r>
+    </w:p>
+    <w:p>
+      <w:pPr>
+        <w:jc w:val="center"/>
+      </w:pPr>
+      <w:r>
+        <w:rPr>
+          <w:i/>
+          <w:color w:val="607D8B"/>
+          <w:sz w:val="18"/>
+        </w:rPr>
+        <w:t>Rys. 7. Dekompozycja szeregu — trend, sezonowość, reszty.</w:t>
+      </w:r>
+    </w:p>
+    <w:p/>
+    <w:p>
+      <w:pPr>
+        <w:pStyle w:val="Heading2"/>
+      </w:pPr>
+      <w:r>
+        <w:t>7.2 Analiza predykcyjna</w:t>
+      </w:r>
+    </w:p>
+    <w:p>
+      <w:r>
+        <w:t>Zbudowano model regresji liniowej (LinearRegression) z cechami: godzina, dzień tygodnia, miesiąc, weekend, temperatura. Podział: trening 2015–2017, test 2018 (out-of-time validation).</w:t>
+      </w:r>
+    </w:p>
+    <w:p>
+      <w:pPr>
+        <w:jc w:val="center"/>
+      </w:pPr>
+      <w:r>
+        <w:drawing>
+          <wp:inline xmlns:a="http://schemas.openxmlformats.org/drawingml/2006/main" xmlns:pic="http://schemas.openxmlformats.org/drawingml/2006/picture">
+            <wp:extent cx="5669280" cy="1921198"/>
+            <wp:docPr id="8" name="Picture 8"/>
+            <wp:cNvGraphicFramePr>
+              <a:graphicFrameLocks noChangeAspect="1"/>
+            </wp:cNvGraphicFramePr>
+            <a:graphic>
+              <a:graphicData uri="http://schemas.openxmlformats.org/drawingml/2006/picture">
+                <pic:pic>
+                  <pic:nvPicPr>
+                    <pic:cNvPr id="0" name="05_prognoza.png"/>
+                    <pic:cNvPicPr/>
+                  </pic:nvPicPr>
+                  <pic:blipFill>
+                    <a:blip r:embed="rId16"/>
+                    <a:stretch>
+                      <a:fillRect/>
+                    </a:stretch>
+                  </pic:blipFill>
+                  <pic:spPr>
+                    <a:xfrm>
+                      <a:off x="0" y="0"/>
+                      <a:ext cx="5669280" cy="1921198"/>
+                    </a:xfrm>
+                    <a:prstGeom prst="rect"/>
+                  </pic:spPr>
+                </pic:pic>
+              </a:graphicData>
+            </a:graphic>
+          </wp:inline>
+        </w:drawing>
+      </w:r>
+    </w:p>
+    <w:p>
+      <w:pPr>
+        <w:jc w:val="center"/>
+      </w:pPr>
+      <w:r>
+        <w:rPr>
+          <w:i/>
+          <w:color w:val="607D8B"/>
+          <w:sz w:val="18"/>
+        </w:rPr>
+        <w:t>Rys. 8. Prognoza vs rzeczywistość (pierwszy tydzień 2018). MAE = 3,384 MW, MAPE = 11.7%, R² = 0.206.</w:t>
+      </w:r>
+    </w:p>
+    <w:p/>
+    <w:p>
+      <w:pPr>
+        <w:pStyle w:val="Heading2"/>
+      </w:pPr>
+      <w:r>
+        <w:t>7.3 Big Data / Spark</w:t>
+      </w:r>
+    </w:p>
+    <w:p>
+      <w:r>
+        <w:t>Ze względu na rozmiar zbioru (~35 tys. wierszy godzinowych) pełna analiza mieści się w pamięci Pandas — nie było konieczności stosowania Apache Spark. Wymaganie „zaawansowana analiza” zrealizowano przez dekompozycję szeregów czasowych i model predykcyjny; opcjonalnie dostępny jest notebook uczenie-maszynowe-projekt.ipynb (Random Forest, sieci neuronowe).</w:t>
+      </w:r>
+    </w:p>
+    <w:p>
+      <w:pPr>
+        <w:pStyle w:val="Heading1"/>
+      </w:pPr>
+      <w:r>
+        <w:t>8. Mapowanie wymagań zaliczeniowych</w:t>
+      </w:r>
+    </w:p>
+    <w:tbl>
+      <w:tblPr>
+        <w:tblStyle w:val="TableGrid"/>
+        <w:tblW w:type="auto" w:w="0"/>
+        <w:tblLook w:firstColumn="1" w:firstRow="1" w:lastColumn="0" w:lastRow="0" w:noHBand="0" w:noVBand="1" w:val="04A0"/>
+      </w:tblPr>
+      <w:tblGrid>
+        <w:gridCol w:w="2880"/>
+        <w:gridCol w:w="2880"/>
+        <w:gridCol w:w="2880"/>
+      </w:tblGrid>
+      <w:tr>
+        <w:tc>
+          <w:tcPr>
+            <w:tcW w:type="dxa" w:w="2880"/>
+          </w:tcPr>
+          <w:p>
+            <w:r>
+              <w:rPr>
+                <w:b/>
+                <w:color w:val="2E7D32"/>
+              </w:rPr>
+              <w:t>Wymaganie</w:t>
+            </w:r>
+          </w:p>
+        </w:tc>
+        <w:tc>
+          <w:tcPr>
+            <w:tcW w:type="dxa" w:w="2880"/>
+          </w:tcPr>
+          <w:p>
+            <w:r>
+              <w:rPr>
+                <w:b/>
+                <w:color w:val="2E7D32"/>
+              </w:rPr>
+              <w:t>Status</w:t>
+            </w:r>
+          </w:p>
+        </w:tc>
+        <w:tc>
+          <w:tcPr>
+            <w:tcW w:type="dxa" w:w="2880"/>
+          </w:tcPr>
+          <w:p>
+            <w:r>
+              <w:rPr>
+                <w:b/>
+                <w:color w:val="2E7D32"/>
+              </w:rPr>
+              <w:t>Lokalizacja</w:t>
+            </w:r>
+          </w:p>
+        </w:tc>
+      </w:tr>
+      <w:tr>
+        <w:tc>
+          <w:tcPr>
+            <w:tcW w:type="dxa" w:w="2880"/>
+          </w:tcPr>
+          <w:p>
+            <w:r>
+              <w:t>Załadowanie do DataFrame</w:t>
+            </w:r>
+          </w:p>
+        </w:tc>
+        <w:tc>
+          <w:tcPr>
+            <w:tcW w:type="dxa" w:w="2880"/>
+          </w:tcPr>
+          <w:p>
+            <w:r>
+              <w:t>Tak</w:t>
+            </w:r>
+          </w:p>
+        </w:tc>
+        <w:tc>
+          <w:tcPr>
+            <w:tcW w:type="dxa" w:w="2880"/>
+          </w:tcPr>
+          <w:p>
+            <w:r>
+              <w:t>§1 analiza.ipynb — read_csv, DatetimeIndex</w:t>
+            </w:r>
+          </w:p>
+        </w:tc>
+      </w:tr>
+      <w:tr>
+        <w:tc>
+          <w:tcPr>
+            <w:tcW w:type="dxa" w:w="2880"/>
+          </w:tcPr>
+          <w:p>
+            <w:r>
+              <w:t>Pre-processing</w:t>
+            </w:r>
+          </w:p>
+        </w:tc>
+        <w:tc>
+          <w:tcPr>
+            <w:tcW w:type="dxa" w:w="2880"/>
+          </w:tcPr>
+          <w:p>
+            <w:r>
+              <w:t>Tak</w:t>
+            </w:r>
+          </w:p>
+        </w:tc>
+        <w:tc>
+          <w:tcPr>
+            <w:tcW w:type="dxa" w:w="2880"/>
+          </w:tcPr>
+          <w:p>
+            <w:r>
+              <w:t>§2 — czyszczenie, join, feature engineering</w:t>
+            </w:r>
+          </w:p>
+        </w:tc>
+      </w:tr>
+      <w:tr>
+        <w:tc>
+          <w:tcPr>
+            <w:tcW w:type="dxa" w:w="2880"/>
+          </w:tcPr>
+          <w:p>
+            <w:r>
+              <w:t>Wizualizacja + dashboard</w:t>
+            </w:r>
+          </w:p>
+        </w:tc>
+        <w:tc>
+          <w:tcPr>
+            <w:tcW w:type="dxa" w:w="2880"/>
+          </w:tcPr>
+          <w:p>
+            <w:r>
+              <w:t>Tak</w:t>
+            </w:r>
+          </w:p>
+        </w:tc>
+        <w:tc>
+          <w:tcPr>
+            <w:tcW w:type="dxa" w:w="2880"/>
+          </w:tcPr>
+          <w:p>
+            <w:r>
+              <w:t>§3 — Matplotlib, Seaborn, Plotly</w:t>
+            </w:r>
+          </w:p>
+        </w:tc>
+      </w:tr>
+      <w:tr>
+        <w:tc>
+          <w:tcPr>
+            <w:tcW w:type="dxa" w:w="2880"/>
+          </w:tcPr>
+          <w:p>
+            <w:r>
+              <w:t>Statystyka + testy</w:t>
+            </w:r>
+          </w:p>
+        </w:tc>
+        <w:tc>
+          <w:tcPr>
+            <w:tcW w:type="dxa" w:w="2880"/>
+          </w:tcPr>
+          <w:p>
+            <w:r>
+              <w:t>Tak</w:t>
+            </w:r>
+          </w:p>
+        </w:tc>
+        <w:tc>
+          <w:tcPr>
+            <w:tcW w:type="dxa" w:w="2880"/>
+          </w:tcPr>
+          <w:p>
+            <w:r>
+              <w:t>§4 — describe, Shapiro, Mann-Whitney, korelacje</w:t>
+            </w:r>
+          </w:p>
+        </w:tc>
+      </w:tr>
+      <w:tr>
+        <w:tc>
+          <w:tcPr>
+            <w:tcW w:type="dxa" w:w="2880"/>
+          </w:tcPr>
+          <w:p>
+            <w:r>
+              <w:t>Analiza zaawansowana</w:t>
+            </w:r>
+          </w:p>
+        </w:tc>
+        <w:tc>
+          <w:tcPr>
+            <w:tcW w:type="dxa" w:w="2880"/>
+          </w:tcPr>
+          <w:p>
+            <w:r>
+              <w:t>Tak</w:t>
+            </w:r>
+          </w:p>
+        </w:tc>
+        <w:tc>
+          <w:tcPr>
+            <w:tcW w:type="dxa" w:w="2880"/>
+          </w:tcPr>
+          <w:p>
+            <w:r>
+              <w:t>§5 — dekompozycja, regresja, MAPE</w:t>
+            </w:r>
+          </w:p>
+        </w:tc>
+      </w:tr>
+      <w:tr>
+        <w:tc>
+          <w:tcPr>
+            <w:tcW w:type="dxa" w:w="2880"/>
+          </w:tcPr>
+          <w:p>
+            <w:r>
+              <w:t>Podsumowanie i wnioski</w:t>
+            </w:r>
+          </w:p>
+        </w:tc>
+        <w:tc>
+          <w:tcPr>
+            <w:tcW w:type="dxa" w:w="2880"/>
+          </w:tcPr>
+          <w:p>
+            <w:r>
+              <w:t>Tak</w:t>
+            </w:r>
+          </w:p>
+        </w:tc>
+        <w:tc>
+          <w:tcPr>
+            <w:tcW w:type="dxa" w:w="2880"/>
+          </w:tcPr>
+          <w:p>
+            <w:r>
+              <w:t>§6 notebook + niniejszy rozdział 9</w:t>
+            </w:r>
+          </w:p>
+        </w:tc>
+      </w:tr>
+      <w:tr>
+        <w:tc>
+          <w:tcPr>
+            <w:tcW w:type="dxa" w:w="2880"/>
+          </w:tcPr>
+          <w:p>
+            <w:r>
+              <w:t>Raport Word</w:t>
+            </w:r>
+          </w:p>
+        </w:tc>
+        <w:tc>
+          <w:tcPr>
+            <w:tcW w:type="dxa" w:w="2880"/>
+          </w:tcPr>
+          <w:p>
+            <w:r>
+              <w:t>Tak</w:t>
+            </w:r>
+          </w:p>
+        </w:tc>
+        <w:tc>
+          <w:tcPr>
+            <w:tcW w:type="dxa" w:w="2880"/>
+          </w:tcPr>
+          <w:p>
+            <w:r>
+              <w:t>docs/raport.docx</w:t>
+            </w:r>
+          </w:p>
+        </w:tc>
+      </w:tr>
+      <w:tr>
+        <w:tc>
+          <w:tcPr>
+            <w:tcW w:type="dxa" w:w="2880"/>
+          </w:tcPr>
+          <w:p>
+            <w:r>
+              <w:t>Prezentacja + kod</w:t>
+            </w:r>
+          </w:p>
+        </w:tc>
+        <w:tc>
+          <w:tcPr>
+            <w:tcW w:type="dxa" w:w="2880"/>
+          </w:tcPr>
+          <w:p>
+            <w:r>
+              <w:t>Tak</w:t>
+            </w:r>
+          </w:p>
+        </w:tc>
+        <w:tc>
+          <w:tcPr>
+            <w:tcW w:type="dxa" w:w="2880"/>
+          </w:tcPr>
+          <w:p>
+            <w:r>
+              <w:t>docs/prezentacja.pptx, analiza.ipynb</w:t>
+            </w:r>
+          </w:p>
+        </w:tc>
+      </w:tr>
+    </w:tbl>
+    <w:p>
+      <w:pPr>
+        <w:pStyle w:val="Heading1"/>
+      </w:pPr>
+      <w:r>
+        <w:t>9. Podsumowanie i wnioski</w:t>
+      </w:r>
+    </w:p>
+    <w:p>
+      <w:r>
+        <w:t>Na podstawie przeprowadzonej analizy sformułowano następujące wnioski:</w:t>
       </w:r>
     </w:p>
     <w:p>
@@ -340,7 +1597,7 @@
         <w:pStyle w:val="ListBullet"/>
       </w:pPr>
       <w:r>
-        <w:t>Zużycie ma silną sezonowość i niższy poziom w weekendy.</w:t>
+        <w:t>Zużycie energii elektrycznej w Hiszpanii w latach 2015–2018 wykazuje wyraźną sezonowość roczną oraz cykliczność tygodniową — potwierdzoną testem Mann-Whitney (weekendy istotnie słabsze).</w:t>
       </w:r>
     </w:p>
     <w:p>
@@ -348,7 +1605,7 @@
         <w:pStyle w:val="ListBullet"/>
       </w:pPr>
       <w:r>
-        <w:t>Profil dobowy: dwa szczyty w dni robocze.</w:t>
+        <w:t>Profil dobowy w dni robocze ma dwa szczyty (poranny i wieczorny); w weekendy krzywa jest niższa i bardziej płaska — istotne dla planowania szczytów i rezerw mocy.</w:t>
       </w:r>
     </w:p>
     <w:p>
@@ -356,7 +1613,7 @@
         <w:pStyle w:val="ListBullet"/>
       </w:pPr>
       <w:r>
-        <w:t>OZE rośnie sezonowo; gaz reguluje szczyty.</w:t>
+        <w:t>Struktura produkcji zmienia się w kierunku większego udziału OZE; paliwa kopalne nadal pełnią rolę regulacyjną w okresach szczytowego zapotrzebowania.</w:t>
       </w:r>
     </w:p>
     <w:p>
@@ -364,7 +1621,23 @@
         <w:pStyle w:val="ListBullet"/>
       </w:pPr>
       <w:r>
-        <w:t>Model MLR osiąga MAPE ≈ 11.7% — sensowny baseline.</w:t>
+        <w:t>Temperatura jest istotnym predyktorem zużycia (r = 0.20) — modelowanie musi uwzględniać dane meteorologiczne.</w:t>
+      </w:r>
+    </w:p>
+    <w:p>
+      <w:pPr>
+        <w:pStyle w:val="ListBullet"/>
+      </w:pPr>
+      <w:r>
+        <w:t>Model regresji liniowej (5 cech) osiąga MAPE ≈ 11.7% na danych 2018 — stanowi baseline; dalsza poprawa wymaga modeli sezonowych (SARIMA) lub uczenia maszynowego.</w:t>
+      </w:r>
+    </w:p>
+    <w:p>
+      <w:pPr>
+        <w:pStyle w:val="ListBullet"/>
+      </w:pPr>
+      <w:r>
+        <w:t>Projekt spełnia wszystkie wymagania zaliczeniowe przedmiotu: Pandas, wizualizacja, statystyka, analiza zaawansowana oraz pełna dokumentacja (raport, prezentacja, kod źródłowy).</w:t>
       </w:r>
     </w:p>
     <w:p>
@@ -372,12 +1645,44 @@
         <w:pStyle w:val="Heading1"/>
       </w:pPr>
       <w:r>
-        <w:t>5. Załączniki</w:t>
+        <w:t>10. Załączniki</w:t>
       </w:r>
     </w:p>
     <w:p>
       <w:r>
-        <w:t>Kod: analiza.ipynb  |  Prezentacja: docs/prezentacja.pptx</w:t>
+        <w:t>Do projektu dołączono:</w:t>
+      </w:r>
+    </w:p>
+    <w:p>
+      <w:pPr>
+        <w:pStyle w:val="ListBullet"/>
+      </w:pPr>
+      <w:r>
+        <w:t>Załącznik A — kod źródłowy: analiza.ipynb (repozytorium GitHub)</w:t>
+      </w:r>
+    </w:p>
+    <w:p>
+      <w:pPr>
+        <w:pStyle w:val="ListBullet"/>
+      </w:pPr>
+      <w:r>
+        <w:t>Załącznik B — prezentacja: docs/prezentacja.pptx</w:t>
+      </w:r>
+    </w:p>
+    <w:p>
+      <w:pPr>
+        <w:pStyle w:val="ListBullet"/>
+      </w:pPr>
+      <w:r>
+        <w:t>Załącznik C — dane: datasets/energy_dataset.csv, weather_features.csv</w:t>
+      </w:r>
+    </w:p>
+    <w:p>
+      <w:pPr>
+        <w:pStyle w:val="ListBullet"/>
+      </w:pPr>
+      <w:r>
+        <w:t>Załącznik D (opcjonalnie) — etl.ipynb, uczenie-maszynowe-projekt.ipynb</w:t>
       </w:r>
     </w:p>
     <w:sectPr>

</xml_diff>